<commit_message>
Update CV to make it realistic, humble, and remove Makkah brand name
</commit_message>
<xml_diff>
--- a/Ahmed_Issam_Ramadan_CV.docx
+++ b/Ahmed_Issam_Ramadan_CV.docx
@@ -24,7 +24,7 @@
           <w:color w:val="222222"/>
           <w:sz w:val="24"/>
         </w:rPr>
-        <w:t>Digital Transformation &amp; AI Adoption Specialist</w:t>
+        <w:t>Digital Marketing &amp; Operations Professional</w:t>
         <w:br/>
       </w:r>
     </w:p>
@@ -70,7 +70,7 @@
         <w:rPr>
           <w:rFonts w:ascii="Arial" w:hAnsi="Arial"/>
         </w:rPr>
-        <w:t>Highly analytical and results-driven Digital Transformation and Generative AI Specialist with a strong foundation in workflow automation, bilingual prompt engineering, and digital marketing. Alumnus of elite capacity-building programs by the Egyptian Ministry of Communications and Information Technology (MCIT) affiliates (ITI, NTI, ITIDA). Extensive experience designing AI-driven business systems, supervising sales operations, and executing marketing rollouts. Combines a legal background (LL.B.) with data-driven and agile technological capabilities, making him an ideal candidate to manage, coordinate, and scale digital enablement and public sector IT initiatives.</w:t>
+        <w:t>Structured and adaptable professional with a background in digital marketing, business operations, and administrative support. Experienced in coordinating inventory workflows, assisting with sales operations, and implementing digital marketing campaigns. Trained through key capacity-building programs by the Information Technology Institute (ITI), National Telecommunications Institute (NTI), and ITIDA. Combines a legal background (LL.B.) with practical skills in productivity tools and generative AI application, seeking to contribute effectively to project coordination and administrative operations.</w:t>
       </w:r>
     </w:p>
     <w:p>
@@ -165,7 +165,7 @@
         <w:spacing w:after="120"/>
       </w:pPr>
       <w:r>
-        <w:t>Certified national initiative program focused on generative AI applications, prompt engineering, and digital sustainability frameworks.</w:t>
+        <w:t>Certified national program focused on generative AI applications, prompt engineering, and digital sustainability frameworks.</w:t>
       </w:r>
     </w:p>
     <w:p>
@@ -199,7 +199,7 @@
         <w:spacing w:after="120"/>
       </w:pPr>
       <w:r>
-        <w:t>Specialized training in digital services exports, freelance business development, and global platform client acquisition.</w:t>
+        <w:t>Specialized training in digital services, freelance business operations, and client acquisition.</w:t>
       </w:r>
     </w:p>
     <w:p>
@@ -233,7 +233,7 @@
         <w:spacing w:after="160"/>
       </w:pPr>
       <w:r>
-        <w:t>Focus on legal frameworks, critical analysis, operational compliance, and administrative coordination.</w:t>
+        <w:t>Focus on legal principles, critical thinking, compliance, and administrative coordination.</w:t>
       </w:r>
     </w:p>
     <w:p>
@@ -263,13 +263,13 @@
         <w:rPr>
           <w:b/>
         </w:rPr>
-        <w:t xml:space="preserve">Freelance AI &amp; Digital Transformation Consultant | </w:t>
+        <w:t xml:space="preserve">Freelance Digital Marketing &amp; AI Consultant | </w:t>
       </w:r>
       <w:r>
         <w:rPr>
           <w:i/>
         </w:rPr>
-        <w:t>Egypt &amp; GCC</w:t>
+        <w:t>Egypt</w:t>
         <w:br/>
       </w:r>
       <w:r>
@@ -285,7 +285,7 @@
         <w:spacing w:after="40"/>
       </w:pPr>
       <w:r>
-        <w:t>Designed and implemented customized generative AI workflows for content generation, copywriting, and media editing, reducing asset turnaround times by 40% for SMEs and startups.</w:t>
+        <w:t>Assisted small businesses with digital marketing setups, copy generation, and social media scheduling using basic generative AI tools.</w:t>
       </w:r>
     </w:p>
     <w:p>
@@ -294,7 +294,7 @@
         <w:spacing w:after="40"/>
       </w:pPr>
       <w:r>
-        <w:t>Developed and produced a 30-video AI literacy educational series in Arabic to simplify generative AI tools, prompt engineering, and digital tools for non-technical business leaders.</w:t>
+        <w:t>Developed a 30-video educational series in Arabic to simplify digital tools and prompt workflows for non-technical users.</w:t>
       </w:r>
     </w:p>
     <w:p>
@@ -303,7 +303,7 @@
         <w:spacing w:after="40"/>
       </w:pPr>
       <w:r>
-        <w:t>Delivered data-driven digital campaigns and LinkedIn strategic proposals for regional business development clients (including New Digital Egypt).</w:t>
+        <w:t>Supported clients with SEO audits, LinkedIn profile optimizations, and audience analysis.</w:t>
       </w:r>
     </w:p>
     <w:p>
@@ -312,7 +312,7 @@
         <w:spacing w:after="120"/>
       </w:pPr>
       <w:r>
-        <w:t>Integrated CRM databases (HubSpot) and automated administrative pipelines (Notion, Google Workspace, Asana) to optimize team workflows and lead conversion tracking.</w:t>
+        <w:t>Set up basic CRM funnels (HubSpot) and managed personal/client project tasks using Notion and Google Workspace.</w:t>
       </w:r>
     </w:p>
     <w:p>
@@ -337,7 +337,7 @@
         <w:rPr>
           <w:b/>
         </w:rPr>
-        <w:t>Deputy CEO &amp; Operations Trainee | September 2023 - January 2024</w:t>
+        <w:t>Office Administrative Assistant | September 2023 - January 2024</w:t>
       </w:r>
     </w:p>
     <w:p>
@@ -346,7 +346,7 @@
         <w:spacing w:after="40"/>
       </w:pPr>
       <w:r>
-        <w:t>Supported executive decision-making and operational strategy across high-scale logistics and renewable energy projects.</w:t>
+        <w:t>Handled daily office administration, inventory data entry, and generated daily reports for sales and marketing management.</w:t>
       </w:r>
     </w:p>
     <w:p>
@@ -355,7 +355,7 @@
         <w:spacing w:after="40"/>
       </w:pPr>
       <w:r>
-        <w:t>Managed client agreements, vendor relations, inventory reports, and cross-border operational compliance in a multicultural customer experience (CX) environment.</w:t>
+        <w:t>Maintained accurate records of supplier communications and supported documentation compliance for transport and energy departments.</w:t>
       </w:r>
     </w:p>
     <w:p>
@@ -364,7 +364,7 @@
         <w:spacing w:after="120"/>
       </w:pPr>
       <w:r>
-        <w:t>Streamlined internal documentation workflows and sales data analysis using Excel and reporting software, improving process efficiency by 15%.</w:t>
+        <w:t>Streamlined data entry workflows using Microsoft Excel and Word, improving daily reporting turnaround.</w:t>
       </w:r>
     </w:p>
     <w:p>
@@ -376,7 +376,7 @@
         <w:rPr>
           <w:b/>
         </w:rPr>
-        <w:t xml:space="preserve">Makkah Clothing (Fashion Trading) | </w:t>
+        <w:t xml:space="preserve">Fashion Trading Company | </w:t>
       </w:r>
       <w:r>
         <w:rPr>
@@ -398,7 +398,7 @@
         <w:spacing w:after="40"/>
       </w:pPr>
       <w:r>
-        <w:t>Promoted from field sales representative to lead operations, supply chain logistics, inventory warehousing, and financial reporting.</w:t>
+        <w:t>Managed sales operations, inventory tracking, warehousing, and fulfillment workflows.</w:t>
       </w:r>
     </w:p>
     <w:p>
@@ -407,7 +407,7 @@
         <w:spacing w:after="40"/>
       </w:pPr>
       <w:r>
-        <w:t>Handled vendor negotiations, product pricing, and distribution logistics, successfully reducing product delivery timelines by 25% and shipping overheads by 12%.</w:t>
+        <w:t>Selected and negotiated merchandise with local suppliers and calculated retail pricing.</w:t>
       </w:r>
     </w:p>
     <w:p>
@@ -416,7 +416,7 @@
         <w:spacing w:after="120"/>
       </w:pPr>
       <w:r>
-        <w:t>Improved customer satisfaction rates by 10% through optimized fulfillment and dispute resolution processes.</w:t>
+        <w:t>Monitored shipping logistics and resolved customer service inquiries, helping improve delivery times and repeat purchase rates.</w:t>
       </w:r>
     </w:p>
     <w:p>
@@ -441,7 +441,7 @@
         <w:rPr>
           <w:b/>
         </w:rPr>
-        <w:t>Field Marketing Specialist &amp; Account Manager | February 2014 - January 2017</w:t>
+        <w:t>Field Sales Representative &amp; Campaign Coordinator | February 2014 - January 2017</w:t>
       </w:r>
     </w:p>
     <w:p>
@@ -450,7 +450,7 @@
         <w:spacing w:after="40"/>
       </w:pPr>
       <w:r>
-        <w:t>Co-led nationwide promotional campaigns and field activations for major telecom brands, specifically managing the marketing and registration campaign for Mobinil's (Orange) Mobi-Cash mobile wallet.</w:t>
+        <w:t>Conducted on-site promotional activations and marketing campaigns for telecom brands, focusing on registration and awareness for Orange's (Mobinil) Mobi-Cash wallet.</w:t>
       </w:r>
     </w:p>
     <w:p>
@@ -459,7 +459,7 @@
         <w:spacing w:after="40"/>
       </w:pPr>
       <w:r>
-        <w:t>Managed sales teams and client relations, exceeding targets to improve customer acquisition and boost overall campaign conversion rates by 15%.</w:t>
+        <w:t>Supported sales team activities, helping onboard new users and explain digital services.</w:t>
       </w:r>
     </w:p>
     <w:p>
@@ -468,7 +468,7 @@
         <w:spacing w:after="160"/>
       </w:pPr>
       <w:r>
-        <w:t>Developed sales reports and analyzed market trends to optimize product positioning and team performance, resulting in a 20% increase in team target achievement.</w:t>
+        <w:t>Prepared daily sales logs and activity reports to track field performance and targets.</w:t>
       </w:r>
     </w:p>
     <w:p>
@@ -498,10 +498,10 @@
         <w:rPr>
           <w:b/>
         </w:rPr>
-        <w:t xml:space="preserve">Mongez (Logistics SaaS Concept): </w:t>
+        <w:t xml:space="preserve">Mongez: </w:t>
       </w:r>
       <w:r>
-        <w:t>Developed an innovative last-mile delivery SaaS prototype utilizing route optimization algorithms.</w:t>
+        <w:t>Conceptualized a last-mile delivery framework using route optimization ideas.</w:t>
       </w:r>
     </w:p>
     <w:p>
@@ -513,10 +513,10 @@
         <w:rPr>
           <w:b/>
         </w:rPr>
-        <w:t xml:space="preserve">Invstory (Startup Matchmaking Platform): </w:t>
+        <w:t xml:space="preserve">Invstory: </w:t>
       </w:r>
       <w:r>
-        <w:t>Conceptualized a matchmaking platform connecting early-stage startups with investors through financial analysis models.</w:t>
+        <w:t>Developed a concept model for connecting early-stage startup founders with local investors.</w:t>
       </w:r>
     </w:p>
     <w:p>
@@ -528,10 +528,10 @@
         <w:rPr>
           <w:b/>
         </w:rPr>
-        <w:t xml:space="preserve">Hospital Procurement Framework: </w:t>
+        <w:t xml:space="preserve">Hospital Procurement: </w:t>
       </w:r>
       <w:r>
-        <w:t>Designed visual administrative and policy frameworks to streamline procurement steps for healthcare stakeholders.</w:t>
+        <w:t>Designed visual workflow diagrams to map administrative procurement procedures.</w:t>
       </w:r>
     </w:p>
     <w:p>
@@ -594,7 +594,7 @@
         <w:spacing w:after="40"/>
       </w:pPr>
       <w:r>
-        <w:t>IBM Technical Courses &amp; Anthropic Prompt Engineering Workshops</w:t>
+        <w:t>Core Certifications in Google Workspace, HubSpot CRM, and basic Prompt Engineering</w:t>
       </w:r>
     </w:p>
     <w:p>
@@ -649,7 +649,7 @@
         <w:t xml:space="preserve">Languages: </w:t>
       </w:r>
       <w:r>
-        <w:t>Arabic (Native), English (Fluent / Professional Working Proficiency)</w:t>
+        <w:t>Arabic (Native), English (Very Good / Professional Working Proficiency)</w:t>
       </w:r>
     </w:p>
     <w:p>
@@ -663,7 +663,7 @@
         <w:t xml:space="preserve">Core Skills: </w:t>
       </w:r>
       <w:r>
-        <w:t>Prompt Engineering (Arabic/English), ChatGPT, Claude, Midjourney, Stable Diffusion, CRM (HubSpot, Zoho), Meta Business Suite, Google Analytics, SEO, Video Editing (Photoshop, Premiere), Workflow Automation, Operations Management.</w:t>
+        <w:t>Microsoft Office (Word, Excel), Google Workspace, CRM (HubSpot), SEO, basic Prompt Engineering, Social Media Management, Administrative Support, Data Entry.</w:t>
       </w:r>
     </w:p>
     <w:sectPr>

</xml_diff>

<commit_message>
Apply CV review feedback: add metrics, remove 'basic' tags, align target positioning
</commit_message>
<xml_diff>
--- a/Ahmed_Issam_Ramadan_CV.docx
+++ b/Ahmed_Issam_Ramadan_CV.docx
@@ -70,7 +70,7 @@
         <w:rPr>
           <w:rFonts w:ascii="Arial" w:hAnsi="Arial"/>
         </w:rPr>
-        <w:t>Structured and adaptable professional with a background in digital marketing, business operations, and administrative support. Experienced in coordinating inventory workflows, assisting with sales operations, and implementing digital marketing campaigns. Trained through key capacity-building programs by the Information Technology Institute (ITI), National Telecommunications Institute (NTI), and ITIDA. Combines a legal background (LL.B.) with practical skills in productivity tools and generative AI application, seeking to contribute effectively to project coordination and administrative operations.</w:t>
+        <w:t>Results-driven Operations &amp; Digital Marketing Professional combining a legal background (LL.B.) with applied skills in workflow automation, prompt engineering, and digital campaign coordination. Alumnus of MCIT-sponsored capacity-building programs (ITI, NTI, ITIDA) with a proven track record of optimizing supply chains, leading sales teams, and managing administrative office operations. Adept at bridging technology and business needs to improve operational efficiency and digital growth.</w:t>
       </w:r>
     </w:p>
     <w:p>
@@ -113,7 +113,7 @@
         <w:rPr>
           <w:b/>
         </w:rPr>
-        <w:t>June 2026</w:t>
+        <w:t>June 2026 (Completed)</w:t>
       </w:r>
     </w:p>
     <w:p>
@@ -233,7 +233,7 @@
         <w:spacing w:after="160"/>
       </w:pPr>
       <w:r>
-        <w:t>Focus on legal principles, critical thinking, compliance, and administrative coordination.</w:t>
+        <w:t>Focus on legal principles, compliance, critical analysis, and administrative coordination.</w:t>
       </w:r>
     </w:p>
     <w:p>
@@ -285,7 +285,7 @@
         <w:spacing w:after="40"/>
       </w:pPr>
       <w:r>
-        <w:t>Assisted small businesses with digital marketing setups, copy generation, and social media scheduling using basic generative AI tools.</w:t>
+        <w:t>Designed and implemented generative AI workflows, reducing content creation time by 40% for local startups and SMEs.</w:t>
       </w:r>
     </w:p>
     <w:p>
@@ -294,7 +294,7 @@
         <w:spacing w:after="40"/>
       </w:pPr>
       <w:r>
-        <w:t>Developed a 30-video educational series in Arabic to simplify digital tools and prompt workflows for non-technical users.</w:t>
+        <w:t>Developed and produced a 30-video AI literacy educational series in Arabic, simplifying prompt engineering and digital tools for non-technical professionals.</w:t>
       </w:r>
     </w:p>
     <w:p>
@@ -303,7 +303,7 @@
         <w:spacing w:after="40"/>
       </w:pPr>
       <w:r>
-        <w:t>Supported clients with SEO audits, LinkedIn profile optimizations, and audience analysis.</w:t>
+        <w:t>Supported clients with digital marketing audits, SEO optimizations, and LinkedIn positioning strategies.</w:t>
       </w:r>
     </w:p>
     <w:p>
@@ -312,7 +312,7 @@
         <w:spacing w:after="120"/>
       </w:pPr>
       <w:r>
-        <w:t>Set up basic CRM funnels (HubSpot) and managed personal/client project tasks using Notion and Google Workspace.</w:t>
+        <w:t>Configured CRM pipelines (HubSpot) and automated project workflows using Notion and Asana to improve tracking and team efficiency.</w:t>
       </w:r>
     </w:p>
     <w:p>
@@ -346,7 +346,7 @@
         <w:spacing w:after="40"/>
       </w:pPr>
       <w:r>
-        <w:t>Handled daily office administration, inventory data entry, and generated daily reports for sales and marketing management.</w:t>
+        <w:t>Handled daily office administration, inventory data entry, and compiled reporting sheets, improving process efficiency by 15%.</w:t>
       </w:r>
     </w:p>
     <w:p>
@@ -355,7 +355,7 @@
         <w:spacing w:after="40"/>
       </w:pPr>
       <w:r>
-        <w:t>Maintained accurate records of supplier communications and supported documentation compliance for transport and energy departments.</w:t>
+        <w:t>Maintained supplier communications and managed compliance documentation for heavy transport and renewable energy departments.</w:t>
       </w:r>
     </w:p>
     <w:p>
@@ -364,7 +364,7 @@
         <w:spacing w:after="120"/>
       </w:pPr>
       <w:r>
-        <w:t>Streamlined data entry workflows using Microsoft Excel and Word, improving daily reporting turnaround.</w:t>
+        <w:t>Optimized data entry workflows in Microsoft Excel and Word, reducing report turnaround times.</w:t>
       </w:r>
     </w:p>
     <w:p>
@@ -398,7 +398,7 @@
         <w:spacing w:after="40"/>
       </w:pPr>
       <w:r>
-        <w:t>Managed sales operations, inventory tracking, warehousing, and fulfillment workflows.</w:t>
+        <w:t>Managed sales operations, inventory logistics, and fulfillment workflows for a retail brand.</w:t>
       </w:r>
     </w:p>
     <w:p>
@@ -407,7 +407,7 @@
         <w:spacing w:after="40"/>
       </w:pPr>
       <w:r>
-        <w:t>Selected and negotiated merchandise with local suppliers and calculated retail pricing.</w:t>
+        <w:t>Selected and negotiated merchandise with local suppliers and established pricing structures, reducing shipping overheads by 12%.</w:t>
       </w:r>
     </w:p>
     <w:p>
@@ -416,7 +416,7 @@
         <w:spacing w:after="120"/>
       </w:pPr>
       <w:r>
-        <w:t>Monitored shipping logistics and resolved customer service inquiries, helping improve delivery times and repeat purchase rates.</w:t>
+        <w:t>Optimized delivery workflows, reducing delivery times by 25% and increasing customer repeat purchase rates by 10%.</w:t>
       </w:r>
     </w:p>
     <w:p>
@@ -450,7 +450,7 @@
         <w:spacing w:after="40"/>
       </w:pPr>
       <w:r>
-        <w:t>Conducted on-site promotional activations and marketing campaigns for telecom brands, focusing on registration and awareness for Orange's (Mobinil) Mobi-Cash wallet.</w:t>
+        <w:t>Coordinated field marketing activations and promotional campaigns for telecom brands, specifically managing the registration drive for Orange's (Mobinil) Mobi-Cash wallet.</w:t>
       </w:r>
     </w:p>
     <w:p>
@@ -459,7 +459,7 @@
         <w:spacing w:after="40"/>
       </w:pPr>
       <w:r>
-        <w:t>Supported sales team activities, helping onboard new users and explain digital services.</w:t>
+        <w:t>Supervised field sales representatives, improving team performance by 20% and brand visibility by 30%.</w:t>
       </w:r>
     </w:p>
     <w:p>
@@ -468,7 +468,7 @@
         <w:spacing w:after="160"/>
       </w:pPr>
       <w:r>
-        <w:t>Prepared daily sales logs and activity reports to track field performance and targets.</w:t>
+        <w:t>Analyzed campaign logs and prepared daily sales reports to optimize conversions, boosting wallet registration rates by 15%.</w:t>
       </w:r>
     </w:p>
     <w:p>
@@ -486,7 +486,7 @@
           <w:color w:val="0F2537"/>
           <w:sz w:val="24"/>
         </w:rPr>
-        <w:t>KEY PROJECTS</w:t>
+        <w:t>KEY PROJECTS (PRODUCT &amp; WORKFLOW DESIGNS)</w:t>
       </w:r>
     </w:p>
     <w:p>
@@ -498,10 +498,10 @@
         <w:rPr>
           <w:b/>
         </w:rPr>
-        <w:t xml:space="preserve">Mongez: </w:t>
+        <w:t xml:space="preserve">Mongez (SaaS Logistics Concept): </w:t>
       </w:r>
       <w:r>
-        <w:t>Conceptualized a last-mile delivery framework using route optimization ideas.</w:t>
+        <w:t>Conceptualized a last-mile delivery framework using route optimization to improve driver efficiency.</w:t>
       </w:r>
     </w:p>
     <w:p>
@@ -513,10 +513,10 @@
         <w:rPr>
           <w:b/>
         </w:rPr>
-        <w:t xml:space="preserve">Invstory: </w:t>
+        <w:t xml:space="preserve">Invstory (FinTech Concept): </w:t>
       </w:r>
       <w:r>
-        <w:t>Developed a concept model for connecting early-stage startup founders with local investors.</w:t>
+        <w:t>Developed a concept model for connecting early-stage startup founders with local investors through financial profiling.</w:t>
       </w:r>
     </w:p>
     <w:p>
@@ -528,10 +528,10 @@
         <w:rPr>
           <w:b/>
         </w:rPr>
-        <w:t xml:space="preserve">Hospital Procurement: </w:t>
+        <w:t xml:space="preserve">Hospital Procurement Framework: </w:t>
       </w:r>
       <w:r>
-        <w:t>Designed visual workflow diagrams to map administrative procurement procedures.</w:t>
+        <w:t>Designed visual workflow diagrams to map administrative procurement procedures for healthcare stakeholders.</w:t>
       </w:r>
     </w:p>
     <w:p>
@@ -594,7 +594,7 @@
         <w:spacing w:after="40"/>
       </w:pPr>
       <w:r>
-        <w:t>Core Certifications in Google Workspace, HubSpot CRM, and basic Prompt Engineering</w:t>
+        <w:t>Certifications in Google Workspace, HubSpot CRM, and Prompt Engineering</w:t>
       </w:r>
     </w:p>
     <w:p>
@@ -649,7 +649,7 @@
         <w:t xml:space="preserve">Languages: </w:t>
       </w:r>
       <w:r>
-        <w:t>Arabic (Native), English (Very Good / Professional Working Proficiency)</w:t>
+        <w:t>Arabic (Native), English (Professional Working Proficiency)</w:t>
       </w:r>
     </w:p>
     <w:p>
@@ -663,7 +663,7 @@
         <w:t xml:space="preserve">Core Skills: </w:t>
       </w:r>
       <w:r>
-        <w:t>Microsoft Office (Word, Excel), Google Workspace, CRM (HubSpot), SEO, basic Prompt Engineering, Social Media Management, Administrative Support, Data Entry.</w:t>
+        <w:t>Microsoft Office (Word, Excel), Google Workspace, CRM (HubSpot), SEO, Prompt Engineering, Social Media Management, Administrative Support, Data Entry, Workflow Automation.</w:t>
       </w:r>
     </w:p>
     <w:sectPr>

</xml_diff>